<commit_message>
Fix OMML equation bugs + add EXCLUDE_MAP for sync
- eq_sr_snr: fix orphaned superscript by using _sup_builder to make
  the fraction the base of the m:sSup element: (A/sigma^2)^2
- eq_snr_gain: same fix for (sigma/theta)^4
- Add _sup_builder helper for complex base superscript elements
- Add EXCLUDE_MAP entry to exclude generation scripts and cover
  letter/title page from public repo sync
- Regenerate manuscript_measurement.docx and PDF

Co-Authored-By: Tatsuki Onishi <bougtoir@gmail.com>
</commit_message>
<xml_diff>
--- a/dvs_noise_inverse_problem/measurement_submission/manuscript_measurement.docx
+++ b/dvs_noise_inverse_problem/measurement_submission/manuscript_measurement.docx
@@ -196,9 +196,27 @@
           </m:r>
           <m:sSup>
             <m:e>
-              <m:r>
-                <m:t xml:space="preserve"/>
-              </m:r>
+              <m:f>
+                <m:num>
+                  <m:r>
+                    <m:t xml:space="preserve">A</m:t>
+                  </m:r>
+                </m:num>
+                <m:den>
+                  <m:sSup>
+                    <m:e>
+                      <m:r>
+                        <m:t xml:space="preserve">σ</m:t>
+                      </m:r>
+                    </m:e>
+                    <m:sup>
+                      <m:r>
+                        <m:t xml:space="preserve">2</m:t>
+                      </m:r>
+                    </m:sup>
+                  </m:sSup>
+                </m:den>
+              </m:f>
             </m:e>
             <m:sup>
               <m:r>
@@ -206,27 +224,6 @@
               </m:r>
             </m:sup>
           </m:sSup>
-          <m:f>
-            <m:num>
-              <m:r>
-                <m:t xml:space="preserve">A</m:t>
-              </m:r>
-            </m:num>
-            <m:den>
-              <m:sSup>
-                <m:e>
-                  <m:r>
-                    <m:t xml:space="preserve">σ</m:t>
-                  </m:r>
-                </m:e>
-                <m:sup>
-                  <m:r>
-                    <m:t xml:space="preserve">2</m:t>
-                  </m:r>
-                </m:sup>
-              </m:sSup>
-            </m:den>
-          </m:f>
           <m:r>
             <m:t xml:space="preserve"> </m:t>
           </m:r>
@@ -595,9 +592,18 @@
           </m:r>
           <m:sSup>
             <m:e>
-              <m:r>
-                <m:t xml:space="preserve"/>
-              </m:r>
+              <m:f>
+                <m:num>
+                  <m:r>
+                    <m:t xml:space="preserve">σ</m:t>
+                  </m:r>
+                </m:num>
+                <m:den>
+                  <m:r>
+                    <m:t xml:space="preserve">θ</m:t>
+                  </m:r>
+                </m:den>
+              </m:f>
             </m:e>
             <m:sup>
               <m:r>
@@ -605,18 +611,6 @@
               </m:r>
             </m:sup>
           </m:sSup>
-          <m:f>
-            <m:num>
-              <m:r>
-                <m:t xml:space="preserve">σ</m:t>
-              </m:r>
-            </m:num>
-            <m:den>
-              <m:r>
-                <m:t xml:space="preserve">θ</m:t>
-              </m:r>
-            </m:den>
-          </m:f>
           <m:r>
             <m:t xml:space="preserve"> </m:t>
           </m:r>

</xml_diff>